<commit_message>
Build 9: Update MakerWorld images, add lock detail render, and refresh MAKERWORLD publication package
</commit_message>
<xml_diff>
--- a/Plate-Forge-Documentation.docx
+++ b/Plate-Forge-Documentation.docx
@@ -2083,7 +2083,61 @@
           <w:color w:val="5A636E"/>
           <w:sz w:val="18"/>
         </w:rPr>
-        <w:t>The easel as printed: two side fins, a plinth that doubles as the front lip, and a rear tie.</w:t>
+        <w:t>The monolithic stand as printed: 100% bed-grounded uprights with grooved channels, dual side key locks, and rear tie.</w:t>
+      </w:r>
+    </w:p>
+    <w:p>
+      <w:pPr>
+        <w:spacing w:before="120" w:after="60"/>
+        <w:jc w:val="center"/>
+      </w:pPr>
+      <w:r>
+        <w:drawing>
+          <wp:inline xmlns:a="http://schemas.openxmlformats.org/drawingml/2006/main" xmlns:pic="http://schemas.openxmlformats.org/drawingml/2006/picture">
+            <wp:extent cx="4860000" cy="3037500"/>
+            <wp:docPr id="6" name="Picture 6"/>
+            <wp:cNvGraphicFramePr>
+              <a:graphicFrameLocks noChangeAspect="1"/>
+            </wp:cNvGraphicFramePr>
+            <a:graphic>
+              <a:graphicData uri="http://schemas.openxmlformats.org/drawingml/2006/picture">
+                <pic:pic>
+                  <pic:nvPicPr>
+                    <pic:cNvPr id="0" name="lock-detail.png"/>
+                    <pic:cNvPicPr/>
+                  </pic:nvPicPr>
+                  <pic:blipFill>
+                    <a:blip r:embed="rId14"/>
+                    <a:stretch>
+                      <a:fillRect/>
+                    </a:stretch>
+                  </pic:blipFill>
+                  <pic:spPr>
+                    <a:xfrm>
+                      <a:off x="0" y="0"/>
+                      <a:ext cx="4860000" cy="3037500"/>
+                    </a:xfrm>
+                    <a:prstGeom prst="rect"/>
+                  </pic:spPr>
+                </pic:pic>
+              </a:graphicData>
+            </a:graphic>
+          </wp:inline>
+        </w:drawing>
+      </w:r>
+    </w:p>
+    <w:p>
+      <w:pPr>
+        <w:spacing w:after="240"/>
+        <w:jc w:val="center"/>
+      </w:pPr>
+      <w:r>
+        <w:rPr>
+          <w:i/>
+          <w:color w:val="5A636E"/>
+          <w:sz w:val="18"/>
+        </w:rPr>
+        <w:t>Close-up of the grooved channel and 0.5 mm snug-fit side key lock engaging the panel notch.</w:t>
       </w:r>
     </w:p>
     <w:p>

</xml_diff>